<commit_message>
Updated Info and Headshot
</commit_message>
<xml_diff>
--- a/public/Derek-Campbell-Resume.docx
+++ b/public/Derek-Campbell-Resume.docx
@@ -100,7 +100,19 @@
         <w:rPr>
           <w:rFonts w:asciiTheme="minorHAnsi" w:hAnsiTheme="minorHAnsi" w:cstheme="minorHAnsi"/>
         </w:rPr>
-        <w:t>derek.campbell10@gmail.com</w:t>
+        <w:t>derek.campbell</w:t>
+      </w:r>
+      <w:r>
+        <w:rPr>
+          <w:rFonts w:asciiTheme="minorHAnsi" w:hAnsiTheme="minorHAnsi" w:cstheme="minorHAnsi"/>
+        </w:rPr>
+        <w:t>6940</w:t>
+      </w:r>
+      <w:r>
+        <w:rPr>
+          <w:rFonts w:asciiTheme="minorHAnsi" w:hAnsiTheme="minorHAnsi" w:cstheme="minorHAnsi"/>
+        </w:rPr>
+        <w:t>@gmail.com</w:t>
       </w:r>
       <w:r>
         <w:rPr>
@@ -1175,13 +1187,7 @@
         <w:rPr>
           <w:rFonts w:asciiTheme="minorHAnsi" w:hAnsiTheme="minorHAnsi" w:cstheme="minorHAnsi"/>
         </w:rPr>
-        <w:t xml:space="preserve">Installed </w:t>
-      </w:r>
-      <w:r>
-        <w:rPr>
-          <w:rFonts w:asciiTheme="minorHAnsi" w:hAnsiTheme="minorHAnsi" w:cstheme="minorHAnsi"/>
-        </w:rPr>
-        <w:t>and connected</w:t>
+        <w:t>Installed and connected</w:t>
       </w:r>
       <w:r>
         <w:rPr>
@@ -1222,13 +1228,7 @@
         <w:rPr>
           <w:rFonts w:asciiTheme="minorHAnsi" w:hAnsiTheme="minorHAnsi" w:cstheme="minorHAnsi"/>
         </w:rPr>
-        <w:t xml:space="preserve">Diagnosed </w:t>
-      </w:r>
-      <w:r>
-        <w:rPr>
-          <w:rFonts w:asciiTheme="minorHAnsi" w:hAnsiTheme="minorHAnsi" w:cstheme="minorHAnsi"/>
-        </w:rPr>
-        <w:t>and resolved</w:t>
+        <w:t>Diagnosed and resolved</w:t>
       </w:r>
       <w:r>
         <w:rPr>
@@ -1269,13 +1269,7 @@
         <w:rPr>
           <w:rFonts w:asciiTheme="minorHAnsi" w:hAnsiTheme="minorHAnsi" w:cstheme="minorHAnsi"/>
         </w:rPr>
-        <w:t xml:space="preserve">Partnered </w:t>
-      </w:r>
-      <w:r>
-        <w:rPr>
-          <w:rFonts w:asciiTheme="minorHAnsi" w:hAnsiTheme="minorHAnsi" w:cstheme="minorHAnsi"/>
-        </w:rPr>
-        <w:t>with network and infrastructure teams to</w:t>
+        <w:t>Partnered with network and infrastructure teams to</w:t>
       </w:r>
       <w:r>
         <w:rPr>
@@ -1600,13 +1594,7 @@
         <w:rPr>
           <w:rFonts w:asciiTheme="minorHAnsi" w:hAnsiTheme="minorHAnsi" w:cstheme="minorHAnsi"/>
         </w:rPr>
-        <w:t xml:space="preserve">Installed </w:t>
-      </w:r>
-      <w:r>
-        <w:rPr>
-          <w:rFonts w:asciiTheme="minorHAnsi" w:hAnsiTheme="minorHAnsi" w:cstheme="minorHAnsi"/>
-        </w:rPr>
-        <w:t>and configured</w:t>
+        <w:t>Installed and configured</w:t>
       </w:r>
       <w:r>
         <w:rPr>
@@ -1645,13 +1633,7 @@
         <w:rPr>
           <w:rFonts w:asciiTheme="minorHAnsi" w:hAnsiTheme="minorHAnsi" w:cstheme="minorHAnsi"/>
         </w:rPr>
-        <w:t xml:space="preserve">Maintained </w:t>
-      </w:r>
-      <w:r>
-        <w:rPr>
-          <w:rFonts w:asciiTheme="minorHAnsi" w:hAnsiTheme="minorHAnsi" w:cstheme="minorHAnsi"/>
-        </w:rPr>
-        <w:t>and updated</w:t>
+        <w:t>Maintained and updated</w:t>
       </w:r>
       <w:r>
         <w:rPr>
@@ -1793,18 +1775,6 @@
         </w:rPr>
         <w:t>May 2024</w:t>
       </w:r>
-    </w:p>
-    <w:p>
-      <w:pPr>
-        <w:tabs>
-          <w:tab w:val="right" w:pos="10970"/>
-        </w:tabs>
-        <w:spacing w:after="0"/>
-        <w:rPr>
-          <w:rFonts w:asciiTheme="minorHAnsi" w:eastAsia="Times New Roman" w:hAnsiTheme="minorHAnsi" w:cstheme="minorHAnsi"/>
-          <w:b/>
-        </w:rPr>
-      </w:pPr>
     </w:p>
     <w:sectPr>
       <w:pgSz w:w="12240" w:h="15840"/>
@@ -10294,6 +10264,7 @@
   <w:style w:type="character" w:default="1" w:styleId="DefaultParagraphFont">
     <w:name w:val="Default Paragraph Font"/>
     <w:uiPriority w:val="1"/>
+    <w:semiHidden/>
     <w:unhideWhenUsed/>
   </w:style>
   <w:style w:type="table" w:default="1" w:styleId="TableNormal">

</xml_diff>